<commit_message>
Correct report to match the code
</commit_message>
<xml_diff>
--- a/docs/report/Assignment_I_Report.docx
+++ b/docs/report/Assignment_I_Report.docx
@@ -1129,15 +1129,15 @@
         <w:spacing w:after="160" w:line="288"/>
       </w:pPr>
       <w:r>
-        <w:t xml:space="preserve">exportkit, the required external dependency, formats dataset records into CSV/JSON for the Processing Service. I built a malicious fixture (packages/exportkit-malicious) declaring the identical package name and version as the real one, preserving its normal output, but additionally attempting to read RESEARCH_WORKSPACE_JWT_SECRET — the shared inter-service signing secret — from the process environment and smuggle it into the exported content as an extra field. I chose this target because it's the highest-impact thing actually reachable from inside the Processing Service's own process in this architecture: the malicious code has no shared filesystem or network path to the Resource Service's database (separate container, no shared volume), so a secret leaked via the environment is the realistic worst case here, not a contrived one.</w:t>
-      </w:r>
-    </w:p>
-    <w:p>
-      <w:pPr>
-        <w:spacing w:after="160" w:line="288"/>
-      </w:pPr>
-      <w:r>
-        <w:t xml:space="preserve">The malicious code enters entirely through the package's own functions — nothing in services/processing-service/app.py was edited to accommodate it; tests/test_supply_chain.py swaps it in purely at the Python import level, simulating an approved supplier update that turns out to be compromised.</w:t>
+        <w:t xml:space="preserve">exportkit, the required external dependency, formats dataset records into CSV/JSON for the Processing Service. I built a malicious fixture (packages/exportkit-malicious) declaring the identical package name and version as the real one, preserving its normal output, but additionally attempting to read RESEARCH_WORKSPACE_JWT_SECRET — the shared inter-service signing secret — from the process environment and smuggle it into the exported content as an extra field. I chose this target because it is the highest-impact thing reachable from inside the Processing Service's own process: the secret would let an attacker forge tokens for every service. What the compromised package can reach is set by the Processing Service's own credentials and deployment: its process environment (including that secret), the compose network (so the Resource Service's HTTP API) and its own container filesystem — but not the Resource Service's SQLite file (separate container, no shared volume). I read this from the compose file and the code; I did not test it separately.</w:t>
+      </w:r>
+    </w:p>
+    <w:p>
+      <w:pPr>
+        <w:spacing w:after="160" w:line="288"/>
+      </w:pPr>
+      <w:r>
+        <w:t xml:space="preserve">The malicious code enters entirely through the package's own functions — nothing in services/processing-service/app.py was edited to accommodate it; services/processing-service/tests/test_supply_chain.py swaps it in purely at the Python import level, simulating an approved supplier update that turns out to be compromised.</w:t>
       </w:r>
     </w:p>
     <w:p>
@@ -1158,7 +1158,7 @@
         <w:spacing w:after="90"/>
       </w:pPr>
       <w:r>
-        <w:t xml:space="preserve">Experiment A (install-time): manifest/approved_packages.json, controlled by the consumer rather than the supplier, pins the benign wheel's exact SHA-256 digest. scripts/verify_manifest.py rejects the malicious wheel even though its declared name and version are byte-for-byte identical to the approved one — identity alone was never the gate.</w:t>
+        <w:t xml:space="preserve">Experiment A (install-time): manifest/approved_packages.json, controlled by the consumer rather than the supplier, pins the benign wheel's exact SHA-256 digest. scripts/verify_manifest.py rejects the malicious wheel even though its declared name and version are byte-for-byte identical to the approved one — identity alone was never the gate. The check sits in the installation path itself: the Processing Service Dockerfile and the Jenkins build stage verify the wheel before pip install, and a Docker build with the malicious wheel in place fails (artifacts/docker-build-malicious-wheel-rejected.txt).</w:t>
       </w:r>
     </w:p>
     <w:p>
@@ -1171,7 +1171,7 @@
         <w:spacing w:after="90"/>
       </w:pPr>
       <w:r>
-        <w:t xml:space="preserve">Experiment B (runtime): validate_export_output re-parses whatever exportkit actually produced and rejects the export (HTTP 422) if it contains any field beyond the single authorized record's own keys. tests/test_supply_chain.py proves, in order: the malicious fixture really does attempt the leak; the leak is blocked and nothing poisoned ever reaches the Resource Service; and the legitimate job still completes normally afterward with the real, benign dependency restored.</w:t>
+        <w:t xml:space="preserve">Experiment B (runtime): validate_export_output re-parses whatever exportkit actually produced and rejects the export (HTTP 422) if it contains any field beyond the single authorized record's own keys. The same test file proves, in order: the malicious fixture really does attempt the leak; the leak is blocked and nothing poisoned ever reaches the Resource Service; and the legitimate job still completes normally afterward with the real, benign dependency restored. This contains only the in-band channel: code already running inside the Processing Service could still use the shared secret directly (for example to forge an admin token), which is why per-service asymmetric keys are the first production change listed in Section 6.</w:t>
       </w:r>
     </w:p>
     <w:p>
@@ -1188,7 +1188,15 @@
         <w:spacing w:after="160" w:line="288"/>
       </w:pPr>
       <w:r>
-        <w:t xml:space="preserve">docs/SSDLC_PLAN.md was committed before any service code, mapping each phase (requirements → implementation/build → testing → release) to a required deliverable and a gate. In practice this meant the architecture, trust boundaries, and the four vulnerability classes to plant were decided before implementation started, which is why V1–V4 map cleanly onto specific, pre-identified places in the design (a resource-owning endpoint, the one identity-verification function, a database query, a cross-service trust boundary) rather than being bugs found by chance afterward. The testing gate in that plan — “investigation and fixes,” with test evidence — is the reason every vulnerability in this project exists as a real plant-commit/test-commit/fix-commit sequence in git history, not just a described risk.</w:t>
+        <w:t xml:space="preserve">docs/SSDLC_PLAN.md was committed before any service code, mapping each phase (requirements → implementation/build → testing → release) to a required deliverable and a gate. In practice this meant the architecture, trust boundaries, and the four vulnerability classes to plant were decided before implementation started, which is why V1–V4 map cleanly onto specific, pre-identified places in the design (a resource-owning endpoint, the one identity-verification function, a database query, a cross-service trust boundary) rather than being bugs found by chance afterward. The testing gate in that plan — “investigation and fixes,” with test evidence — is the reason every vulnerability in this project exists in git history as a real planting commit that includes a passing exploit test, followed by a fix commit that rewrites that test to assert the secure behaviour — not just a described risk. (The initial plan had described a separate failing exploit-test commit; this deviation is recorded in section 9 of docs/SSDLC_PLAN.md.)</w:t>
+      </w:r>
+    </w:p>
+    <w:p>
+      <w:pPr>
+        <w:spacing w:after="160" w:line="288"/>
+      </w:pPr>
+      <w:r>
+        <w:t xml:space="preserve">The Jenkinsfile defines which findings block a release: any failing unit or end-to-end functional/authorization test, any ruff finding, any pip-audit finding (pip-audit has no severity threshold, so every finding blocks), a broken dependency set (pip check), and any wheel whose name, version and SHA-256 do not match the approval manifest, which is checked before the wheel is installed; the malicious wheel is the control case and must be rejected. The pipeline itself has not been executed on a Jenkins server. The same commands were run by hand and their results are saved in artifacts/ (all unit and end-to-end tests passing, ruff clean, pip-audit clean for all three services, the end-to-end suite run against the docker-compose stack). Evidence by commit: V1 and V3 planted in 1dfd1d8 and fixed in cde57d6; V2 in 1ccefc1, fixed in 5cdc098; V4 in d0303b2, fixed in 0fca8b3; the supply-chain experiment in 47a5eb1; the docker-compose environment and end-to-end tests in c10d1f0.</w:t>
       </w:r>
     </w:p>
     <w:p>
@@ -1248,7 +1256,7 @@
         <w:spacing w:after="90"/>
       </w:pPr>
       <w:r>
-        <w:t xml:space="preserve">Deployment configuration: the shared JWT secret is read from an environment variable with a clearly-labelled dev-only fallback, and each service runs as its own container/process with its own SQLite file, so a compromise of one component's filesystem does not automatically expose another's data — confirmed, not assumed, during the supply-chain experiment in Section 5.</w:t>
+        <w:t xml:space="preserve">Deployment configuration: the shared JWT secret is read from an environment variable with a clearly-labelled dev-only fallback, and each service runs as its own container/process with its own SQLite file, so a compromise of one component's filesystem does not automatically expose another's data. This follows from the compose configuration; it does not limit what a compromised component can do with the shared secret and its network access (Section 5).</w:t>
       </w:r>
     </w:p>
     <w:p>
@@ -1450,7 +1458,7 @@
         <w:spacing w:after="160" w:line="288"/>
       </w:pPr>
       <w:r>
-        <w:t xml:space="preserve">33 per-service unit/security tests (12 resource-service, 11 application-api, 10 processing-service) plus 8 cross-service integration/authorization tests in tests/, all passing at the current commit; verified both locally and against the full docker-compose stack (see README.md §4–6).</w:t>
+        <w:t xml:space="preserve">39 per-service unit/security tests (15 resource-service, 11 application-api, 13 processing-service) plus 8 cross-service integration/authorization tests in tests/, all passing; the 8 end-to-end tests were also run against the full docker-compose stack (see README.md §4–6). Saved results are in artifacts/.</w:t>
       </w:r>
     </w:p>
     <w:sectPr>

</xml_diff>

<commit_message>
Update report: Experiment B results
</commit_message>
<xml_diff>
--- a/docs/report/Assignment_I_Report.docx
+++ b/docs/report/Assignment_I_Report.docx
@@ -1129,15 +1129,15 @@
         <w:spacing w:after="160" w:line="288"/>
       </w:pPr>
       <w:r>
-        <w:t xml:space="preserve">exportkit, the required external dependency, formats dataset records into CSV/JSON for the Processing Service. I built a malicious fixture (packages/exportkit-malicious) declaring the identical package name and version as the real one, preserving its normal output, but additionally attempting to read RESEARCH_WORKSPACE_JWT_SECRET — the shared inter-service signing secret — from the process environment and smuggle it into the exported content as an extra field. I chose this target because it is the highest-impact thing reachable from inside the Processing Service's own process: the secret would let an attacker forge tokens for every service. What the compromised package can reach is set by the Processing Service's own credentials and deployment: its process environment (including that secret), the compose network (so the Resource Service's HTTP API) and its own container filesystem — but not the Resource Service's SQLite file (separate container, no shared volume). I read this from the compose file and the code; I did not test it separately.</w:t>
-      </w:r>
-    </w:p>
-    <w:p>
-      <w:pPr>
-        <w:spacing w:after="160" w:line="288"/>
-      </w:pPr>
-      <w:r>
-        <w:t xml:space="preserve">The malicious code enters entirely through the package's own functions — nothing in services/processing-service/app.py was edited to accommodate it; services/processing-service/tests/test_supply_chain.py swaps it in purely at the Python import level, simulating an approved supplier update that turns out to be compromised.</w:t>
+        <w:t xml:space="preserve">exportkit, the required external dependency, formats dataset records into CSV/JSON for the Processing Service. I built a malicious fixture (packages/exportkit-malicious) declaring the identical package name and version as the real one, preserving its normal output, but additionally attempting to read RESEARCH_WORKSPACE_JWT_SECRET — the shared inter-service signing secret — from the process environment and smuggle it into the exported content as an extra field. I chose this target because it is the highest-impact thing reachable from inside the Processing Service's own process: the secret would let an attacker forge tokens for every service. What the compromised package can reach is set by the Processing Service's own credentials and deployment, which Experiment B measured with a probe inside the container: its process environment (including that secret), the Resource Service's HTTP API (401 without a token) and outbound internet access — but no database file and no volumes, because the Resource Service's SQLite file lives in a separate container.</w:t>
+      </w:r>
+    </w:p>
+    <w:p>
+      <w:pPr>
+        <w:spacing w:after="160" w:line="288"/>
+      </w:pPr>
+      <w:r>
+        <w:t xml:space="preserve">The malicious code enters entirely through the package installation path and the package's own functions — nothing in services/processing-service/app.py was edited to accommodate it. Experiment B (scripts/experiment_b.py) models a compromised supplier release that the consumer accepts: in an isolated docker-compose project, a separate manifest approves the malicious wheel's name, version and digest, the Dockerfile installs it, and the normal workflow (login, upload, export through the Application API) is run.</w:t>
       </w:r>
     </w:p>
     <w:p>
@@ -1171,7 +1171,7 @@
         <w:spacing w:after="90"/>
       </w:pPr>
       <w:r>
-        <w:t xml:space="preserve">Experiment B (runtime): validate_export_output re-parses whatever exportkit actually produced and rejects the export (HTTP 422) if it contains any field beyond the single authorized record's own keys. The same test file proves, in order: the malicious fixture really does attempt the leak; the leak is blocked and nothing poisoned ever reaches the Resource Service; and the legitimate job still completes normally afterward with the real, benign dependency restored. This contains only the in-band channel: code already running inside the Processing Service could still use the shared secret directly (for example to forge an admin token), which is why per-service asymmetric keys are the first production change listed in Section 6.</w:t>
+        <w:t xml:space="preserve">Experiment B (approved compromised update, three phases, evidence in artifacts/experiment-b/). Before the boundary, using the Processing Service as it was in commit 0fca8b3 (no output validation), alice's ordinary export returned HTTP 201 with the JWT secret in an extra column, and the same secret was stored in the Resource Service: the unauthorized access succeeded, and that output is preserved. After the boundary, validate_export_output re-parses whatever exportkit actually produced and rejects the export (HTTP 422, nothing stored) if it contains any field beyond the authorized record's own keys. With the benign wheel the legitimate job still completes (HTTP 201, no extra field). The probe also showed the container ran as root, so a non-root user was added. This contains only the in-band channel: code already running inside the Processing Service could still use the shared secret directly (for example to forge an admin token) or send it out over the open network, which is why per-service asymmetric keys and egress filtering are the first production changes listed in Section 6.</w:t>
       </w:r>
     </w:p>
     <w:p>
@@ -1196,7 +1196,7 @@
         <w:spacing w:after="160" w:line="288"/>
       </w:pPr>
       <w:r>
-        <w:t xml:space="preserve">The Jenkinsfile defines which findings block a release: any failing unit or end-to-end functional/authorization test, any ruff finding, any pip-audit finding (pip-audit has no severity threshold, so every finding blocks), a broken dependency set (pip check), and any wheel whose name, version and SHA-256 do not match the approval manifest, which is checked before the wheel is installed; the malicious wheel is the control case and must be rejected. The pipeline itself has not been executed on a Jenkins server. The same commands were run by hand and their results are saved in artifacts/ (all unit and end-to-end tests passing, ruff clean, pip-audit clean for all three services, the end-to-end suite run against the docker-compose stack). Evidence by commit: V1 and V3 planted in 1dfd1d8 and fixed in cde57d6; V2 in 1ccefc1, fixed in 5cdc098; V4 in d0303b2, fixed in 0fca8b3; the supply-chain experiment in 47a5eb1; the docker-compose environment and end-to-end tests in c10d1f0.</w:t>
+        <w:t xml:space="preserve">The Jenkinsfile defines which findings block a release: any failing unit or end-to-end functional/authorization test, any ruff finding, any pip-audit finding (pip-audit has no severity threshold, so every finding blocks), a broken dependency set (pip check), and any wheel whose name, version and SHA-256 do not match the approval manifest, which is checked before the wheel is installed; the malicious wheel is the control case and must be rejected. The pipeline itself has not been run to completion on a Jenkins server. The same commands were run by hand and their results are saved in artifacts/ (all unit and end-to-end tests passing, ruff clean, pip-audit clean for all three services, the end-to-end suite run against the docker-compose stack). Evidence by commit: V1 and V3 planted in 1dfd1d8 and fixed in cde57d6; V2 in 1ccefc1, fixed in 5cdc098; V4 in d0303b2, fixed in 0fca8b3; the supply-chain experiment in 47a5eb1 and Experiment B in aa04424; the docker-compose environment and end-to-end tests in c10d1f0.</w:t>
       </w:r>
     </w:p>
     <w:p>
@@ -1402,7 +1402,7 @@
         <w:spacing w:after="90"/>
       </w:pPr>
       <w:r>
-        <w:t xml:space="preserve">manifest/approved_packages.json, scripts/verify_manifest.py — Experiment A's integrity gate.</w:t>
+        <w:t xml:space="preserve">manifest/approved_packages.json, scripts/verify_manifest.py — Experiment A's integrity gate; manifest/experiment_b/ and scripts/experiment_b.py — Experiment B.</w:t>
       </w:r>
     </w:p>
     <w:p>
@@ -1458,7 +1458,7 @@
         <w:spacing w:after="160" w:line="288"/>
       </w:pPr>
       <w:r>
-        <w:t xml:space="preserve">39 per-service unit/security tests (15 resource-service, 11 application-api, 13 processing-service) plus 8 cross-service integration/authorization tests in tests/, all passing; the 8 end-to-end tests were also run against the full docker-compose stack (see README.md §4–6). Saved results are in artifacts/.</w:t>
+        <w:t xml:space="preserve">40 per-service unit/security tests (16 resource-service, 11 application-api, 13 processing-service) plus 8 cross-service integration/authorization tests in tests/, all passing; the 8 end-to-end tests were also run against the full docker-compose stack, and Experiment B was run end to end (see README.md §4–6). Saved results are in artifacts/.</w:t>
       </w:r>
     </w:p>
     <w:sectPr>

</xml_diff>

<commit_message>
Report: add repository link on the cover page
</commit_message>
<xml_diff>
--- a/docs/report/Assignment_I_Report.docx
+++ b/docs/report/Assignment_I_Report.docx
@@ -102,8 +102,19 @@
           <w:sz w:val="20"/>
           <w:szCs w:val="20"/>
         </w:rPr>
-        <w:t xml:space="preserve">Repository: research-workspace (git history included in submission)</w:t>
-      </w:r>
+        <w:t xml:space="preserve">Repository (full git history included): </w:t>
+      </w:r>
+      <w:hyperlink r:id="rId10">
+        <w:r>
+          <w:rPr>
+            <w:color w:val="0563C1"/>
+            <w:sz w:val="20"/>
+            <w:szCs w:val="20"/>
+            <w:u w:val="single"/>
+          </w:rPr>
+          <w:t>https://github.com/Zakinahimi/software-security-assignment-1</w:t>
+        </w:r>
+      </w:hyperlink>
     </w:p>
     <w:p>
       <w:pPr>

</xml_diff>